<commit_message>
Cours de la semaine
</commit_message>
<xml_diff>
--- a/CEJM/BTS SIO 1/TD 3 les clauses des contrats GAI.docx
+++ b/CEJM/BTS SIO 1/TD 3 les clauses des contrats GAI.docx
@@ -663,27 +663,7 @@
             <w:szCs w:val="24"/>
             <w:lang w:eastAsia="fr-FR"/>
           </w:rPr>
-          <w:t>https://www.captaincontrat.com/articles-droit-commerci</w:t>
-        </w:r>
-        <w:r>
-          <w:rPr>
-            <w:rStyle w:val="Lienhypertexte"/>
-            <w:rFonts w:ascii="Times New Roman" w:eastAsia="Times New Roman" w:hAnsi="Times New Roman" w:cs="Times New Roman"/>
-            <w:sz w:val="24"/>
-            <w:szCs w:val="24"/>
-            <w:lang w:eastAsia="fr-FR"/>
-          </w:rPr>
-          <w:t>a</w:t>
-        </w:r>
-        <w:r>
-          <w:rPr>
-            <w:rStyle w:val="Lienhypertexte"/>
-            <w:rFonts w:ascii="Times New Roman" w:eastAsia="Times New Roman" w:hAnsi="Times New Roman" w:cs="Times New Roman"/>
-            <w:sz w:val="24"/>
-            <w:szCs w:val="24"/>
-            <w:lang w:eastAsia="fr-FR"/>
-          </w:rPr>
-          <w:t>l/contrat-de-prestation-informatique</w:t>
+          <w:t>https://www.captaincontrat.com/articles-droit-commercial/contrat-de-prestation-informatique</w:t>
         </w:r>
       </w:hyperlink>
     </w:p>
@@ -747,7 +727,25 @@
           <w:szCs w:val="21"/>
           <w:lang w:eastAsia="fr-FR"/>
         </w:rPr>
-        <w:t>Un contrat de prestation de services informatiques est une convention par laquelle une personne ou une société s'engage, moyennant rémunération, à réaliser pour un client des missions dans le domaine informatique : conseil, développement, installation, maintenance, formation, etc. Il encadre les obligations, la rémunération, la durée et la responsabilité du prestataire.</w:t>
+        <w:t>Un contrat de prestation de services informatiques est une convention par laquelle une personne ou une société s'engage, moyennant rémunération, à réaliser pour un client des missions dans le domaine informatique : conseil, développement</w:t>
+      </w:r>
+      <w:r>
+        <w:rPr>
+          <w:rFonts w:ascii="Segoe UI" w:eastAsia="Times New Roman" w:hAnsi="Segoe UI" w:cs="Segoe UI"/>
+          <w:sz w:val="21"/>
+          <w:szCs w:val="21"/>
+          <w:lang w:eastAsia="fr-FR"/>
+        </w:rPr>
+        <w:t xml:space="preserve"> logiciel</w:t>
+      </w:r>
+      <w:r>
+        <w:rPr>
+          <w:rFonts w:ascii="Segoe UI" w:eastAsia="Times New Roman" w:hAnsi="Segoe UI" w:cs="Segoe UI"/>
+          <w:sz w:val="21"/>
+          <w:szCs w:val="21"/>
+          <w:lang w:eastAsia="fr-FR"/>
+        </w:rPr>
+        <w:t>, installation, maintenance, formation, etc. Il encadre les obligations, la rémunération, la durée et la responsabilité du prestataire.</w:t>
       </w:r>
     </w:p>
     <w:p>
@@ -792,6 +790,40 @@
           <w:szCs w:val="24"/>
           <w:lang w:eastAsia="fr-FR"/>
         </w:rPr>
+        <w:t>Mentions = clauses = paragraphes</w:t>
+      </w:r>
+    </w:p>
+    <w:p>
+      <w:pPr>
+        <w:spacing w:before="100" w:beforeAutospacing="1" w:after="100" w:afterAutospacing="1" w:line="240" w:lineRule="auto"/>
+        <w:ind w:left="720"/>
+        <w:rPr>
+          <w:rFonts w:ascii="Times New Roman" w:eastAsia="Times New Roman" w:hAnsi="Times New Roman" w:cs="Times New Roman"/>
+          <w:sz w:val="24"/>
+          <w:szCs w:val="24"/>
+          <w:lang w:eastAsia="fr-FR"/>
+        </w:rPr>
+      </w:pPr>
+    </w:p>
+    <w:p>
+      <w:pPr>
+        <w:spacing w:before="100" w:beforeAutospacing="1" w:after="100" w:afterAutospacing="1" w:line="240" w:lineRule="auto"/>
+        <w:ind w:left="720"/>
+        <w:rPr>
+          <w:rFonts w:ascii="Times New Roman" w:eastAsia="Times New Roman" w:hAnsi="Times New Roman" w:cs="Times New Roman"/>
+          <w:sz w:val="24"/>
+          <w:szCs w:val="24"/>
+          <w:lang w:eastAsia="fr-FR"/>
+        </w:rPr>
+      </w:pPr>
+      <w:r>
+        <w:rPr>
+          <w:rFonts w:ascii="Times New Roman" w:eastAsia="Times New Roman" w:hAnsi="Times New Roman" w:cs="Times New Roman"/>
+          <w:sz w:val="24"/>
+          <w:szCs w:val="24"/>
+          <w:lang w:eastAsia="fr-FR"/>
+        </w:rPr>
+        <w:lastRenderedPageBreak/>
         <w:t>Un contrat complet et sécurisé doit notamment inclure :</w:t>
       </w:r>
     </w:p>
@@ -840,7 +872,6 @@
           <w:szCs w:val="24"/>
           <w:lang w:eastAsia="fr-FR"/>
         </w:rPr>
-        <w:lastRenderedPageBreak/>
         <w:t>La durée, les délais d’exécution, les dates de mission.</w:t>
       </w:r>
       <w:r>
@@ -1029,6 +1060,15 @@
         </w:rPr>
         <w:t>Aussi appelé contrat d'externalisation, c’est un type de contrat de prestation informatique dans lequel un prestataire prend en charge tout ou partie d’un service informatique (par exemple, la maintenance, l’hébergement, le support).</w:t>
       </w:r>
+      <w:r>
+        <w:rPr>
+          <w:rFonts w:ascii="Segoe UI" w:eastAsia="Times New Roman" w:hAnsi="Segoe UI" w:cs="Segoe UI"/>
+          <w:sz w:val="21"/>
+          <w:szCs w:val="21"/>
+          <w:lang w:eastAsia="fr-FR"/>
+        </w:rPr>
+        <w:t xml:space="preserve"> Lorsque l'externalisation porte sur la gestion du SI on parle d'un contrat d'infogérance.</w:t>
+      </w:r>
     </w:p>
     <w:p>
       <w:pPr>
@@ -1076,23 +1116,59 @@
     </w:p>
     <w:p>
       <w:pPr>
-        <w:pStyle w:val="Paragraphedeliste"/>
-        <w:spacing w:after="0" w:line="300" w:lineRule="atLeast"/>
-        <w:rPr>
-          <w:rFonts w:ascii="Segoe UI" w:eastAsia="Times New Roman" w:hAnsi="Segoe UI" w:cs="Segoe UI"/>
-          <w:sz w:val="21"/>
-          <w:szCs w:val="21"/>
-          <w:lang w:eastAsia="fr-FR"/>
-        </w:rPr>
-      </w:pPr>
-      <w:r>
-        <w:rPr>
-          <w:rFonts w:ascii="Segoe UI" w:eastAsia="Times New Roman" w:hAnsi="Segoe UI" w:cs="Segoe UI"/>
-          <w:sz w:val="21"/>
-          <w:szCs w:val="21"/>
-          <w:lang w:eastAsia="fr-FR"/>
-        </w:rPr>
-        <w:t>En France, le contrat de sous-traitance est juridiquement une forme de contrat de prestation de services : la sous-traitance correspond à la délégation, par un professionnel, de tout ou partie de ses obligations contractuelles à un tiers.</w:t>
+        <w:spacing w:before="100" w:beforeAutospacing="1" w:after="100" w:afterAutospacing="1" w:line="240" w:lineRule="auto"/>
+        <w:ind w:left="720"/>
+        <w:rPr>
+          <w:rFonts w:ascii="Times New Roman" w:eastAsia="Times New Roman" w:hAnsi="Times New Roman" w:cs="Times New Roman"/>
+          <w:sz w:val="24"/>
+          <w:szCs w:val="24"/>
+          <w:lang w:eastAsia="fr-FR"/>
+        </w:rPr>
+      </w:pPr>
+      <w:r>
+        <w:rPr>
+          <w:rFonts w:ascii="Times New Roman" w:eastAsia="Times New Roman" w:hAnsi="Times New Roman" w:cs="Times New Roman"/>
+          <w:sz w:val="24"/>
+          <w:szCs w:val="24"/>
+          <w:lang w:eastAsia="fr-FR"/>
+        </w:rPr>
+        <w:t>L'externalisation relève d'un contrat</w:t>
+      </w:r>
+      <w:r>
+        <w:rPr>
+          <w:rFonts w:ascii="Times New Roman" w:eastAsia="Times New Roman" w:hAnsi="Times New Roman" w:cs="Times New Roman"/>
+          <w:sz w:val="24"/>
+          <w:szCs w:val="24"/>
+          <w:lang w:eastAsia="fr-FR"/>
+        </w:rPr>
+        <w:t xml:space="preserve"> </w:t>
+      </w:r>
+      <w:r>
+        <w:rPr>
+          <w:rFonts w:ascii="Times New Roman" w:eastAsia="Times New Roman" w:hAnsi="Times New Roman" w:cs="Times New Roman"/>
+          <w:sz w:val="24"/>
+          <w:szCs w:val="24"/>
+          <w:lang w:eastAsia="fr-FR"/>
+        </w:rPr>
+        <w:t>de prestation de service</w:t>
+      </w:r>
+      <w:r>
+        <w:rPr>
+          <w:rFonts w:ascii="Times New Roman" w:eastAsia="Times New Roman" w:hAnsi="Times New Roman" w:cs="Times New Roman"/>
+          <w:sz w:val="24"/>
+          <w:szCs w:val="24"/>
+          <w:lang w:eastAsia="fr-FR"/>
+        </w:rPr>
+        <w:t xml:space="preserve"> car </w:t>
+      </w:r>
+      <w:r>
+        <w:rPr>
+          <w:rFonts w:ascii="Times New Roman" w:eastAsia="Times New Roman" w:hAnsi="Times New Roman" w:cs="Times New Roman"/>
+          <w:sz w:val="24"/>
+          <w:szCs w:val="24"/>
+          <w:lang w:eastAsia="fr-FR"/>
+        </w:rPr>
+        <w:t>elle consiste à confier une activité à un prestataire sur le long terme (plusieurs années) alors que la sous-traitance est limitée dans le temps.</w:t>
       </w:r>
     </w:p>
     <w:p>
@@ -1185,7 +1261,25 @@
           <w:szCs w:val="24"/>
           <w:lang w:eastAsia="fr-FR"/>
         </w:rPr>
-        <w:t>Un tarif basé sur le temps passé (temps × taux horaire ou journalier).</w:t>
+        <w:t xml:space="preserve">Un tarif basé sur le temps passé </w:t>
+      </w:r>
+      <w:r>
+        <w:rPr>
+          <w:rFonts w:ascii="Times New Roman" w:eastAsia="Times New Roman" w:hAnsi="Times New Roman" w:cs="Times New Roman"/>
+          <w:sz w:val="24"/>
+          <w:szCs w:val="24"/>
+          <w:lang w:eastAsia="fr-FR"/>
+        </w:rPr>
+        <w:t xml:space="preserve">et les moyens humain </w:t>
+      </w:r>
+      <w:r>
+        <w:rPr>
+          <w:rFonts w:ascii="Times New Roman" w:eastAsia="Times New Roman" w:hAnsi="Times New Roman" w:cs="Times New Roman"/>
+          <w:sz w:val="24"/>
+          <w:szCs w:val="24"/>
+          <w:lang w:eastAsia="fr-FR"/>
+        </w:rPr>
+        <w:t>(temps × taux horaire ou journalier).</w:t>
       </w:r>
     </w:p>
     <w:p>
@@ -1395,28 +1489,49 @@
           <w:szCs w:val="21"/>
           <w:lang w:eastAsia="fr-FR"/>
         </w:rPr>
-        <w:t xml:space="preserve"> Vérifier</w:t>
-      </w:r>
-      <w:r>
+        <w:t xml:space="preserve"> Vérifier l'utilisation conforme des licences par les entreprises. </w:t>
+      </w:r>
+    </w:p>
+    <w:p>
+      <w:pPr>
+        <w:pStyle w:val="Paragraphedeliste"/>
+        <w:spacing w:after="0" w:line="300" w:lineRule="atLeast"/>
         <w:rPr>
           <w:rFonts w:ascii="Segoe UI" w:eastAsia="Times New Roman" w:hAnsi="Segoe UI" w:cs="Segoe UI"/>
           <w:sz w:val="21"/>
           <w:szCs w:val="21"/>
           <w:lang w:eastAsia="fr-FR"/>
         </w:rPr>
-        <w:t xml:space="preserve"> l'utilisation conforme des licences par les entreprises. </w:t>
-      </w:r>
-    </w:p>
-    <w:p>
-      <w:pPr>
-        <w:pStyle w:val="Paragraphedeliste"/>
-        <w:spacing w:after="0" w:line="300" w:lineRule="atLeast"/>
+      </w:pPr>
+      <w:r>
+        <w:rPr>
+          <w:rFonts w:ascii="Segoe UI" w:eastAsia="Times New Roman" w:hAnsi="Symbol" w:cs="Segoe UI"/>
+          <w:sz w:val="21"/>
+          <w:szCs w:val="21"/>
+          <w:lang w:eastAsia="fr-FR"/>
+        </w:rPr>
+        <w:t></w:t>
+      </w:r>
+      <w:r>
         <w:rPr>
           <w:rFonts w:ascii="Segoe UI" w:eastAsia="Times New Roman" w:hAnsi="Segoe UI" w:cs="Segoe UI"/>
           <w:sz w:val="21"/>
           <w:szCs w:val="21"/>
           <w:lang w:eastAsia="fr-FR"/>
         </w:rPr>
+        <w:t xml:space="preserve"> Contrôler la correspondance entre usage réel et redevances payées. </w:t>
+      </w:r>
+    </w:p>
+    <w:p>
+      <w:pPr>
+        <w:pStyle w:val="Paragraphedeliste"/>
+        <w:spacing w:after="0" w:line="300" w:lineRule="atLeast"/>
+        <w:rPr>
+          <w:rFonts w:ascii="Segoe UI" w:eastAsia="Times New Roman" w:hAnsi="Segoe UI" w:cs="Segoe UI"/>
+          <w:sz w:val="21"/>
+          <w:szCs w:val="21"/>
+          <w:lang w:eastAsia="fr-FR"/>
+        </w:rPr>
       </w:pPr>
       <w:r>
         <w:rPr>
@@ -1425,6 +1540,7 @@
           <w:szCs w:val="21"/>
           <w:lang w:eastAsia="fr-FR"/>
         </w:rPr>
+        <w:lastRenderedPageBreak/>
         <w:t></w:t>
       </w:r>
       <w:r>
@@ -1434,55 +1550,7 @@
           <w:szCs w:val="21"/>
           <w:lang w:eastAsia="fr-FR"/>
         </w:rPr>
-        <w:t xml:space="preserve"> Contrôler</w:t>
-      </w:r>
-      <w:r>
-        <w:rPr>
-          <w:rFonts w:ascii="Segoe UI" w:eastAsia="Times New Roman" w:hAnsi="Segoe UI" w:cs="Segoe UI"/>
-          <w:sz w:val="21"/>
-          <w:szCs w:val="21"/>
-          <w:lang w:eastAsia="fr-FR"/>
-        </w:rPr>
-        <w:t xml:space="preserve"> la correspondance entre usage réel et redevances payées. </w:t>
-      </w:r>
-    </w:p>
-    <w:p>
-      <w:pPr>
-        <w:pStyle w:val="Paragraphedeliste"/>
-        <w:spacing w:after="0" w:line="300" w:lineRule="atLeast"/>
-        <w:rPr>
-          <w:rFonts w:ascii="Segoe UI" w:eastAsia="Times New Roman" w:hAnsi="Segoe UI" w:cs="Segoe UI"/>
-          <w:sz w:val="21"/>
-          <w:szCs w:val="21"/>
-          <w:lang w:eastAsia="fr-FR"/>
-        </w:rPr>
-      </w:pPr>
-      <w:r>
-        <w:rPr>
-          <w:rFonts w:ascii="Segoe UI" w:eastAsia="Times New Roman" w:hAnsi="Symbol" w:cs="Segoe UI"/>
-          <w:sz w:val="21"/>
-          <w:szCs w:val="21"/>
-          <w:lang w:eastAsia="fr-FR"/>
-        </w:rPr>
-        <w:t></w:t>
-      </w:r>
-      <w:r>
-        <w:rPr>
-          <w:rFonts w:ascii="Segoe UI" w:eastAsia="Times New Roman" w:hAnsi="Segoe UI" w:cs="Segoe UI"/>
-          <w:sz w:val="21"/>
-          <w:szCs w:val="21"/>
-          <w:lang w:eastAsia="fr-FR"/>
-        </w:rPr>
-        <w:t xml:space="preserve"> Générer</w:t>
-      </w:r>
-      <w:r>
-        <w:rPr>
-          <w:rFonts w:ascii="Segoe UI" w:eastAsia="Times New Roman" w:hAnsi="Segoe UI" w:cs="Segoe UI"/>
-          <w:sz w:val="21"/>
-          <w:szCs w:val="21"/>
-          <w:lang w:eastAsia="fr-FR"/>
-        </w:rPr>
-        <w:t xml:space="preserve"> des revenus supplémentaires via régularisation et pénalités, souvent de montants importants.</w:t>
+        <w:t xml:space="preserve"> Générer des revenus supplémentaires via régularisation et pénalités, souvent de montants importants.</w:t>
       </w:r>
     </w:p>
     <w:p>
@@ -1538,25 +1606,7 @@
           <w:szCs w:val="21"/>
           <w:lang w:eastAsia="fr-FR"/>
         </w:rPr>
-        <w:t xml:space="preserve">Non, selon l'article, une clause contractuelle peut autoriser l’éditeur à effectuer un audit. Toutefois, certaines pratiques </w:t>
-      </w:r>
-      <w:r>
-        <w:rPr>
-          <w:rFonts w:ascii="Segoe UI" w:eastAsia="Times New Roman" w:hAnsi="Segoe UI" w:cs="Segoe UI"/>
-          <w:sz w:val="21"/>
-          <w:szCs w:val="21"/>
-          <w:lang w:eastAsia="fr-FR"/>
-        </w:rPr>
-        <w:t>extracontractuelles</w:t>
-      </w:r>
-      <w:r>
-        <w:rPr>
-          <w:rFonts w:ascii="Segoe UI" w:eastAsia="Times New Roman" w:hAnsi="Segoe UI" w:cs="Segoe UI"/>
-          <w:sz w:val="21"/>
-          <w:szCs w:val="21"/>
-          <w:lang w:eastAsia="fr-FR"/>
-        </w:rPr>
-        <w:t xml:space="preserve"> (comme l'installation de scripts intrusifs) peuvent être légitimement refusées. Par exemple, Carrefour a obtenu un refus judiciaire à Oracle concernant l’installation de scripts d’audit non contractualisés.</w:t>
+        <w:t>Non, selon l'article, une clause contractuelle peut autoriser l’éditeur à effectuer un audit. Toutefois, certaines pratiques extracontractuelles (comme l'installation de scripts intrusifs) peuvent être légitimement refusées. Par exemple, Carrefour a obtenu un refus judiciaire à Oracle concernant l’installation de scripts d’audit non contractualisés.</w:t>
       </w:r>
     </w:p>
     <w:p>
@@ -1632,16 +1682,7 @@
           <w:szCs w:val="24"/>
           <w:lang w:eastAsia="fr-FR"/>
         </w:rPr>
-        <w:t xml:space="preserve"> Par</w:t>
-      </w:r>
-      <w:r>
-        <w:rPr>
-          <w:rFonts w:ascii="Times New Roman" w:eastAsia="Times New Roman" w:hAnsi="Times New Roman" w:cs="Times New Roman"/>
-          <w:sz w:val="24"/>
-          <w:szCs w:val="24"/>
-          <w:lang w:eastAsia="fr-FR"/>
-        </w:rPr>
-        <w:t xml:space="preserve"> simple demande d’informations (inventaire, déclarations). </w:t>
+        <w:t xml:space="preserve"> Par simple demande d’informations (inventaire, déclarations). </w:t>
       </w:r>
     </w:p>
     <w:p>
@@ -1670,16 +1711,7 @@
           <w:szCs w:val="24"/>
           <w:lang w:eastAsia="fr-FR"/>
         </w:rPr>
-        <w:t xml:space="preserve"> Par</w:t>
-      </w:r>
-      <w:r>
-        <w:rPr>
-          <w:rFonts w:ascii="Times New Roman" w:eastAsia="Times New Roman" w:hAnsi="Times New Roman" w:cs="Times New Roman"/>
-          <w:sz w:val="24"/>
-          <w:szCs w:val="24"/>
-          <w:lang w:eastAsia="fr-FR"/>
-        </w:rPr>
-        <w:t xml:space="preserve"> installation d’outils automatisés de comptage de licences. </w:t>
+        <w:t xml:space="preserve"> Par installation d’outils automatisés de comptage de licences. </w:t>
       </w:r>
     </w:p>
     <w:p>
@@ -1708,16 +1740,7 @@
           <w:szCs w:val="24"/>
           <w:lang w:eastAsia="fr-FR"/>
         </w:rPr>
-        <w:t xml:space="preserve"> Par</w:t>
-      </w:r>
-      <w:r>
-        <w:rPr>
-          <w:rFonts w:ascii="Times New Roman" w:eastAsia="Times New Roman" w:hAnsi="Times New Roman" w:cs="Times New Roman"/>
-          <w:sz w:val="24"/>
-          <w:szCs w:val="24"/>
-          <w:lang w:eastAsia="fr-FR"/>
-        </w:rPr>
-        <w:t xml:space="preserve"> audit sur site réalisé par un auditeur indépendant. </w:t>
+        <w:t xml:space="preserve"> Par audit sur site réalisé par un auditeur indépendant. </w:t>
       </w:r>
     </w:p>
     <w:p>
@@ -1746,16 +1769,7 @@
           <w:szCs w:val="24"/>
           <w:lang w:eastAsia="fr-FR"/>
         </w:rPr>
-        <w:t xml:space="preserve"> Par</w:t>
-      </w:r>
-      <w:r>
-        <w:rPr>
-          <w:rFonts w:ascii="Times New Roman" w:eastAsia="Times New Roman" w:hAnsi="Times New Roman" w:cs="Times New Roman"/>
-          <w:sz w:val="24"/>
-          <w:szCs w:val="24"/>
-          <w:lang w:eastAsia="fr-FR"/>
-        </w:rPr>
-        <w:t xml:space="preserve"> audits plus formels, conduits en présence d’huissier ou sous contrôle judiciaire.</w:t>
+        <w:t xml:space="preserve"> Par audits plus formels, conduits en présence d’huissier ou sous contrôle judiciaire.</w:t>
       </w:r>
     </w:p>
     <w:p>
@@ -1830,16 +1844,7 @@
           <w:szCs w:val="24"/>
           <w:lang w:eastAsia="fr-FR"/>
         </w:rPr>
-        <w:t xml:space="preserve"> Lire</w:t>
-      </w:r>
-      <w:r>
-        <w:rPr>
-          <w:rFonts w:ascii="Times New Roman" w:eastAsia="Times New Roman" w:hAnsi="Times New Roman" w:cs="Times New Roman"/>
-          <w:sz w:val="24"/>
-          <w:szCs w:val="24"/>
-          <w:lang w:eastAsia="fr-FR"/>
-        </w:rPr>
-        <w:t xml:space="preserve"> et négocier attentivement les clauses d’audit avant signature. </w:t>
+        <w:t xml:space="preserve"> Lire et négocier attentivement les clauses d’audit avant signature. </w:t>
       </w:r>
     </w:p>
     <w:p>
@@ -1868,16 +1873,7 @@
           <w:szCs w:val="24"/>
           <w:lang w:eastAsia="fr-FR"/>
         </w:rPr>
-        <w:t xml:space="preserve"> Maintenir</w:t>
-      </w:r>
-      <w:r>
-        <w:rPr>
-          <w:rFonts w:ascii="Times New Roman" w:eastAsia="Times New Roman" w:hAnsi="Times New Roman" w:cs="Times New Roman"/>
-          <w:sz w:val="24"/>
-          <w:szCs w:val="24"/>
-          <w:lang w:eastAsia="fr-FR"/>
-        </w:rPr>
-        <w:t xml:space="preserve"> un inventaire à jour du parc logiciel et des licences.</w:t>
+        <w:t xml:space="preserve"> Maintenir un inventaire à jour du parc logiciel et des licences.</w:t>
       </w:r>
     </w:p>
     <w:p>
@@ -1906,16 +1902,7 @@
           <w:szCs w:val="24"/>
           <w:lang w:eastAsia="fr-FR"/>
         </w:rPr>
-        <w:t xml:space="preserve"> Utiliser</w:t>
-      </w:r>
-      <w:r>
-        <w:rPr>
-          <w:rFonts w:ascii="Times New Roman" w:eastAsia="Times New Roman" w:hAnsi="Times New Roman" w:cs="Times New Roman"/>
-          <w:sz w:val="24"/>
-          <w:szCs w:val="24"/>
-          <w:lang w:eastAsia="fr-FR"/>
-        </w:rPr>
-        <w:t xml:space="preserve"> des outils de gestion centralisée (</w:t>
+        <w:t xml:space="preserve"> Utiliser des outils de gestion centralisée (</w:t>
       </w:r>
       <w:proofErr w:type="spellStart"/>
       <w:r>
@@ -1984,16 +1971,7 @@
           <w:szCs w:val="24"/>
           <w:lang w:eastAsia="fr-FR"/>
         </w:rPr>
-        <w:t xml:space="preserve"> Anticiper</w:t>
-      </w:r>
-      <w:r>
-        <w:rPr>
-          <w:rFonts w:ascii="Times New Roman" w:eastAsia="Times New Roman" w:hAnsi="Times New Roman" w:cs="Times New Roman"/>
-          <w:sz w:val="24"/>
-          <w:szCs w:val="24"/>
-          <w:lang w:eastAsia="fr-FR"/>
-        </w:rPr>
-        <w:t xml:space="preserve"> les coûts liés aux audits et planifier des marges budgétaires. </w:t>
+        <w:t xml:space="preserve"> Anticiper les coûts liés aux audits et planifier des marges budgétaires. </w:t>
       </w:r>
     </w:p>
     <w:p>
@@ -2022,16 +2000,7 @@
           <w:szCs w:val="24"/>
           <w:lang w:eastAsia="fr-FR"/>
         </w:rPr>
-        <w:t xml:space="preserve"> Prévoir</w:t>
-      </w:r>
-      <w:r>
-        <w:rPr>
-          <w:rFonts w:ascii="Times New Roman" w:eastAsia="Times New Roman" w:hAnsi="Times New Roman" w:cs="Times New Roman"/>
-          <w:sz w:val="24"/>
-          <w:szCs w:val="24"/>
-          <w:lang w:eastAsia="fr-FR"/>
-        </w:rPr>
-        <w:t xml:space="preserve"> l’extension des licences aux filiales futures pour éviter toute non-conformité.</w:t>
+        <w:t xml:space="preserve"> Prévoir l’extension des licences aux filiales futures pour éviter toute non-conformité.</w:t>
       </w:r>
     </w:p>
     <w:sectPr>
@@ -3634,6 +3603,7 @@
   <w:style w:type="character" w:default="1" w:styleId="Policepardfaut">
     <w:name w:val="Default Paragraph Font"/>
     <w:uiPriority w:val="1"/>
+    <w:semiHidden/>
     <w:unhideWhenUsed/>
   </w:style>
   <w:style w:type="table" w:default="1" w:styleId="TableauNormal">

</xml_diff>